<commit_message>
Record decisions D-13 and D-14; add estimated costs to the equipment table
D-13: sphere diameters known to 0.025 mm, measured after the matte finish;
no maker's certificate. D-14: no two-sphere bar; procedure section 9 now
describes robot-independent shape checks (free-radius sphere fit, board
flatness) on the held-out poses, and states what they cannot detect. The
report code for those checks follows in a separate commit. Sphere
procurement is deferred pending a market canvass (analysis question 9).
Equipment table gains an estimated-cost column with computed totals.
Both documents were archived under archive/2026-10-06_before_decisions_D13_D14
before editing.

Co-Authored-By: Claude Opus 5.5 <noreply@anthropic.com>
Claude-Session: https://claude.ai/code/session_01LnkFMdRYsdw8VhXMWXEpNu
</commit_message>
<xml_diff>
--- a/docs/analysis/calibration_from_spherical_target_analysis.docx
+++ b/docs/analysis/calibration_from_spherical_target_analysis.docx
@@ -201,7 +201,7 @@
         </w:numPr>
       </w:pPr>
       <w:r>
-        <w:t xml:space="preserve">D-9. Positioner absolute accuracy: 0.1 mm (A2). Consequence: equal to the accuracy target at 500 mm, so the map is positioner-limited at near range; random per-pose positioner errors average down across the spline’s support, but a smooth systematic positioner error would be absorbed into the map, which a two-sphere bar of certified length at a few poses should bound (section 6, S6).</w:t>
+        <w:t xml:space="preserve">D-9. Positioner absolute accuracy: 0.1 mm (A2). Consequence: equal to the accuracy target at 500 mm, so the map is positioner-limited at near range; random per-pose positioner errors average down across the spline’s support, but a smooth systematic positioner error would be absorbed into the map, which a two-sphere bar of certified length at a few poses should bound (section 6, S6). No such bar is available (D-14), so this error is bounded only by the robot maker’s absolute-accuracy calibration.</w:t>
       </w:r>
     </w:p>
     <w:p>
@@ -250,6 +250,42 @@
       </w:pPr>
       <w:r>
         <w:t xml:space="preserve">D-6. The board’s pose is commanded by the positioner, not fitted. Consequence: every board frame is a full observation of the error field over the board’s area, with no unobservable plane parameters (D2).</w:t>
+      </w:r>
+    </w:p>
+    <w:p>
+      <w:pPr>
+        <w:pStyle w:val="Compact"/>
+        <w:numPr>
+          <w:ilvl w:val="0"/>
+          <w:numId w:val="1001"/>
+        </w:numPr>
+      </w:pPr>
+      <w:r>
+        <w:t xml:space="preserve">D-13. Sphere diameters must be known to 0.025 mm, measured after the matte finish; a maker’s certificate is not required. Consequence: a diameter error of 0.025 mm is a radius error of 0.0125 mm, which enters every sphere residual as an offset along the surface normal; that is an eighth of the 0.1 mm target at 500 mm and smaller than the positioner’s 0.1 mm (D-9), so it is not the limiting term. The measurement must follow the finish (bead-blasting, anodizing or paint) and, for an aluminum sphere, be taken at the session’s temperature, since a 152 mm aluminum sphere grows 0.0035 mm per degree C.</w:t>
+      </w:r>
+    </w:p>
+    <w:p>
+      <w:pPr>
+        <w:pStyle w:val="Compact"/>
+        <w:numPr>
+          <w:ilvl w:val="0"/>
+          <w:numId w:val="1001"/>
+        </w:numPr>
+      </w:pPr>
+      <w:r>
+        <w:t xml:space="preserve">D-14. No certified two-sphere bar is available. Consequence: the stage-1 validation has no artifact whose geometry is independent of the robot. Two robot-independent checks replace it on the held-out poses: the radius of each sphere fitted freely, against its measured radius, and the flatness of each board about its own best-fit plane. Both test the shape of the corrected surfaces; neither tests the scale of the volume strongly (a 0.1 percent range-scale error moves a 38.1 mm sphere’s fitted radius by 0.04 mm), and neither detects a smooth systematic positioner error absorbed into the map (D-9). Scale and positioner error are checked only against the robot itself.</w:t>
+      </w:r>
+    </w:p>
+    <w:p>
+      <w:pPr>
+        <w:pStyle w:val="Compact"/>
+        <w:numPr>
+          <w:ilvl w:val="0"/>
+          <w:numId w:val="1001"/>
+        </w:numPr>
+      </w:pPr>
+      <w:r>
+        <w:t xml:space="preserve">Deferred: the choice of precision spheres waits for a canvass of the market (section 10, question 9). The Rothbucher RSLB10M laser-scanner sphere (145 mm, sphericity 0.3 mm, radius within 0.15 mm) is a candidate provisional far-range sphere B; the pose plan is not changed until the choice is made.</w:t>
       </w:r>
     </w:p>
     <w:p>
@@ -2075,7 +2111,7 @@
         </w:numPr>
       </w:pPr>
       <w:r>
-        <w:t xml:space="preserve">Answered (D-5, D-7): 0.1 mm at 500 mm; full frustum 300 to 1,100 mm. Open: whether the target scales with standoff.</w:t>
+        <w:t xml:space="preserve">Answered (D-5, D-7, D-11): 0.1 mm at 500 mm, scaling with standoff; full frustum 300 to 1,100 mm.</w:t>
       </w:r>
     </w:p>
     <w:p>
@@ -2111,7 +2147,7 @@
         </w:numPr>
       </w:pPr>
       <w:r>
-        <w:t xml:space="preserve">Answered (D-9): positioner accuracy 0.1 mm. Open: the mounting offsets of sphere and board to the tool point, and whether a certified two-sphere bar is available for the independent check.</w:t>
+        <w:t xml:space="preserve">Answered (D-9, D-14): positioner accuracy 0.1 mm; no two-sphere bar. The mounting offsets of sphere and board to the tool point are measured in the stage-1 procedure, by the three-ball nest routine for each sphere and the board’s tool frame.</w:t>
       </w:r>
     </w:p>
     <w:p>
@@ -2140,10 +2176,22 @@
     </w:p>
     <w:p>
       <w:pPr>
+        <w:pStyle w:val="Compact"/>
+        <w:numPr>
+          <w:ilvl w:val="0"/>
+          <w:numId w:val="1004"/>
+        </w:numPr>
+      </w:pPr>
+      <w:r>
+        <w:t xml:space="preserve">Open: which precision spheres to buy, pending a canvass of the market. Answered meanwhile (D-13): the diameter must be known to 0.025 mm after finishing.</w:t>
+      </w:r>
+    </w:p>
+    <w:p>
+      <w:pPr>
         <w:pStyle w:val="FirstParagraph"/>
       </w:pPr>
       <w:r>
-        <w:t xml:space="preserve">Every question raised by the analysis is now answered or carried as a stated assumption; the next deliverable is the data-analysis code (section 11).</w:t>
+        <w:t xml:space="preserve">Every question raised by the analysis is now answered or carried as a stated assumption, except the sphere procurement of question 9, which does not block the code.</w:t>
       </w:r>
     </w:p>
     <w:bookmarkEnd w:id="33"/>

</xml_diff>

<commit_message>
Scope of work: procedure section 1, micrometer method, specifications, preparation
Procedure section 1 becomes the complete scope of work: items in hand, items
to build (with drawing numbers), items to buy, purchase specifications for
the spheres and the flat plate, the run-out fixture, and preparation before
the first session. Sphere diameters are measured in-house by micrometer;
both spheres 0.02 mm sphericity (analysis D-13 updated). SGM parameters,
tool load data, dry run, capture trigger through the communication software
and the pose-log location are added to the steps. Mounting figure label no
longer cites a section. Deck content files gain build, buy, specification,
run-out and preparation slides. The shop drawings (appendix D), the
procedure docx and the rebuilt decks follow.

Co-Authored-By: Claude Opus 5.5 <noreply@anthropic.com>
Claude-Session: https://claude.ai/code/session_01LnkFMdRYsdw8VhXMWXEpNu
</commit_message>
<xml_diff>
--- a/docs/analysis/calibration_from_spherical_target_analysis.docx
+++ b/docs/analysis/calibration_from_spherical_target_analysis.docx
@@ -261,7 +261,7 @@
         </w:numPr>
       </w:pPr>
       <w:r>
-        <w:t xml:space="preserve">D-13. Sphere diameters must be known to 0.025 mm, measured after the matte finish; a maker’s certificate is not required. Consequence: a diameter error of 0.025 mm is a radius error of 0.0125 mm, which enters every sphere residual as an offset along the surface normal; that is an eighth of the 0.1 mm target at 500 mm and smaller than the positioner’s 0.1 mm (D-9), so it is not the limiting term. The measurement must follow the finish (bead-blasting, anodizing or paint) and, for an aluminum sphere, be taken at the session’s temperature, since a 152 mm aluminum sphere grows 0.0035 mm per degree C.</w:t>
+        <w:t xml:space="preserve">D-13. Sphere diameters must be known to 0.025 mm, measured in-house with outside micrometers (checked against their setting standards) at no fewer than six orientations after the matte finish; a maker’s certificate and a laboratory measurement are not required. Both spheres must be spherical to 0.02 mm, which the spread of the same micrometer readings checks. Consequence: a diameter error of 0.025 mm is a radius error of 0.0125 mm, which enters every sphere residual as an offset along the surface normal; that is an eighth of the 0.1 mm target at 500 mm and smaller than the positioner’s 0.1 mm (D-9), so it is not the limiting term. The measurement must follow the finish (bead-blasting, anodizing or paint) and, for an aluminum sphere, be taken at the session’s temperature, since a 152 mm aluminum sphere grows 0.0035 mm per degree C.</w:t>
       </w:r>
     </w:p>
     <w:p>
@@ -2183,7 +2183,7 @@
         </w:numPr>
       </w:pPr>
       <w:r>
-        <w:t xml:space="preserve">Open: which precision spheres to buy, pending a canvass of the market. Answered meanwhile (D-13): the diameter must be known to 0.025 mm after finishing.</w:t>
+        <w:t xml:space="preserve">Open: which precision spheres to buy, pending a canvass of the market. Answered meanwhile (D-13): the diameter must be known to 0.025 mm after finishing, measured in-house by micrometer, and both spheres spherical to 0.02 mm.</w:t>
       </w:r>
     </w:p>
     <w:p>

</xml_diff>

<commit_message>
Plan: 50 degree board tilt; smoothing search up to 10^6 (interim)
Interim snapshot: the confirmation rerun of the simulation with these
settings is still running; its results and the simulation folder are
not in this commit.

- Planner default board tilts 0, 20, 40, 50 degrees: the planar
  correction between 40 degrees and the 55 degree cut-off is measured
  instead of inferred. Example plan 217 poses (151 sphere, 66 board).
- Smoothing search grids reach 10^6 (the simulation chose 10^4, the old
  edge, for the position and slope terms).
- Analysis D-19 records the simulation and both changes; procedure
  section 6 and appendix B, figure 2, code_design section 12 and deck 2
  updated. Documents snapshotted in archive/2026-10-09_before_50deg_tilt.
- 161 tests pass.

Co-Authored-By: Claude Opus 5.5 <noreply@anthropic.com>
Claude-Session: https://claude.ai/code/session_01LnkFMdRYsdw8VhXMWXEpNu
</commit_message>
<xml_diff>
--- a/docs/analysis/calibration_from_spherical_target_analysis.docx
+++ b/docs/analysis/calibration_from_spherical_target_analysis.docx
@@ -50,7 +50,7 @@
         <w:pStyle w:val="FirstParagraph"/>
       </w:pPr>
       <w:r>
-        <w:t xml:space="preserve">Status: analysis for discussion, before any code design. Date: 2026-10-03; decision log updated 2026-10-08 (D-15 to D-18: one sphere, the curvature sweep, the measurement-space curvature input, inspection and in-house checks).</w:t>
+        <w:t xml:space="preserve">Status: analysis for discussion, before any code design. Date: 2026-10-03; decision log updated 2026-10-08 and 2026-10-09 (D-15 to D-19: one sphere, the curvature sweep, the measurement-space curvature input, inspection and in-house checks, the simulation of the planned session).</w:t>
       </w:r>
     </w:p>
     <w:p>
@@ -105,7 +105,7 @@
         <w:pStyle w:val="BodyText"/>
       </w:pPr>
       <w:r>
-        <w:t xml:space="preserve">Decisions recorded so far (2026-10-04, with D-15 to D-18 added 2026-10-08):</w:t>
+        <w:t xml:space="preserve">Decisions recorded so far (2026-10-04, with D-15 to D-18 added 2026-10-08 and D-19 on 2026-10-09):</w:t>
       </w:r>
     </w:p>
     <w:p>
@@ -393,7 +393,7 @@
         </w:numPr>
       </w:pPr>
       <w:r>
-        <w:t xml:space="preserve">D-17 (2026-10-08, decided by G Neil Haven). The curvature input of the map is the measurement-space curvature kappa_m = (r / f)^2 x kappa, in mm of depth per px^2, where kappa is the physical curvature (1 / R on a sphere, 0 on the board, the estimated local curvature of a part at runtime), r the range of the pixel and f the focal length in pixels (the geometric mean of fx and fy). The curvature term depends on (kappa_m, range, slope_u, slope_v): linear in kappa_m (one interval, degree 1) and cubic in range and the two slopes. Reasoning: with physical curvature as the input and no range axis (the earlier term on (1 / R, slope_u, slope_v)), one sphere supplies one curvature value at every range, and a bias that grows as Z^2 cannot be represented in that term; it would leak into the position term and be applied to planes, where it does not belong. With kappa_m as the input, the expected pixel-kernel bias is flat along range at fixed kappa_m, which the range-direction smoothness penalty does not resist, and a departure from it (a millimeter-domain effect, D-15) remains representable on the range axis. The input’s upper bound becomes 0.5 mm / px^2 (a 20 mm radius out to about 2,200 mm); sphere B spans about 0.0025 at 300 mm to 0.034 at 1,100 mm. The map stores the focal lengths it was fitted with, so the runtime evaluator forms kappa_m the same way. The no-read map uses the same input.</w:t>
+        <w:t xml:space="preserve">D-17 (2026-10-08). The curvature input of the map is the measurement-space curvature kappa_m = (r / f)^2 x kappa, in mm of depth per px^2, where kappa is the physical curvature (1 / R on a sphere, 0 on the board, the estimated local curvature of a part at runtime), r the range of the pixel and f the focal length in pixels (the geometric mean of fx and fy). The curvature term depends on (kappa_m, range, slope_u, slope_v): linear in kappa_m (one interval, degree 1) and cubic in range and the two slopes. Reasoning: with physical curvature as the input and no range axis (the earlier term on (1 / R, slope_u, slope_v)), one sphere supplies one curvature value at every range, and a bias that grows as Z^2 cannot be represented in that term; it would leak into the position term and be applied to planes, where it does not belong. With kappa_m as the input, the expected pixel-kernel bias is flat along range at fixed kappa_m, which the range-direction smoothness penalty does not resist, and a departure from it (a millimeter-domain effect, D-15) remains representable on the range axis. The input’s upper bound becomes 0.5 mm / px^2 (a 20 mm radius out to about 2,200 mm); sphere B spans about 0.0025 at 300 mm to 0.034 at 1,100 mm. The map stores the focal lengths it was fitted with, so the runtime evaluator forms kappa_m the same way. The no-read map uses the same input.</w:t>
       </w:r>
     </w:p>
     <w:p>
@@ -405,7 +405,31 @@
         </w:numPr>
       </w:pPr>
       <w:r>
-        <w:t xml:space="preserve">D-18 (2026-10-08, decided by G Neil Haven; the same rule in all three projects). No feature-level measurement of the fixtures is made in-house. The purchase orders for SC1-02, SC1-04, SC1-05, SC1-06 and the sphere require the fabricator’s inspection report of the toleranced features, which is kept as the as-built record; the drawings therefore carry tolerances. The in-house checks are limited to: the sphere’s diameter and sphericity by outside micrometer (D-13); the board’s flatness with a straightedge and a 0.05 mm feeler leaf; the board’s width and length with calipers; the board face’s squareness to the flange axis by run-out on the robot (dial indicator, within 0.05 mm over a turn of joint 6); and the nest re-seat check. Flatness is checked with the straightedge, not with the run-out gauge, because a fixed indicator at one radius on a rotating face reads only the run-out at that radius: a tilt shows as a once-per-turn swing, but a dished or crowned face at the same radius reads constant and goes unseen.</w:t>
+        <w:t xml:space="preserve">D-18 (2026-10-08; the same rule in all three projects). No feature-level measurement of the fixtures is made in-house. The purchase orders for SC1-02, SC1-04, SC1-05, SC1-06 and the sphere require the fabricator’s inspection report of the toleranced features, which is kept as the as-built record; the drawings therefore carry tolerances. The in-house checks are limited to: the sphere’s diameter and sphericity by outside micrometer (D-13); the board’s flatness with a straightedge and a 0.05 mm feeler leaf; the board’s width and length with calipers; the board face’s squareness to the flange axis by run-out on the robot (dial indicator, within 0.05 mm over a turn of joint 6); and the nest re-seat check. Flatness is checked with the straightedge, not with the run-out gauge, because a fixed indicator at one radius on a rotating face reads only the run-out at that radius: a tilt shows as a once-per-turn swing, but a dished or crowned face at the same radius reads constant and goes unseen.</w:t>
+      </w:r>
+    </w:p>
+    <w:p>
+      <w:pPr>
+        <w:pStyle w:val="Compact"/>
+        <w:numPr>
+          <w:ilvl w:val="0"/>
+          <w:numId w:val="1001"/>
+        </w:numPr>
+      </w:pPr>
+      <w:r>
+        <w:t xml:space="preserve">D-19 (2026-10-09, after the simulation of the planned session,</w:t>
+      </w:r>
+      <w:r>
+        <w:t xml:space="preserve"> </w:t>
+      </w:r>
+      <w:r>
+        <w:rPr>
+          <w:rStyle w:val="VerbatimChar"/>
+        </w:rPr>
+        <w:t xml:space="preserve">docs/analysis/simulations/2026-10-08_one_sphere/</w:t>
+      </w:r>
+      <w:r>
+        <w:t xml:space="preserve">). The planned session (one sphere on the ladder of D-16, the board at five depths) was rendered at full resolution with a curvature bias shaped like a 7 x 7 matching window and fitted with the production settings. Results, as root-mean-square range error against the true surfaces after removing the fit’s rigid gauge: held-out samples 0.091 mm before correction, 0.013 mm after; held-out sphere samples at 40 to 55 degrees incidence 0.164 mm before, 0.014 mm after; sphere recovery below the D-11 target at every station; probe boards not used in the fit, tilted 30 to 55 degrees at 425 to 1,050 mm, below the target in every cell (the tightest, 55 degrees at 850 mm, 0.170 mm against 0.289 mm). An added millimeter-domain effect (D-15) changed nothing measurable, and an approximation of the former two-sphere plan did no better (held-out spheres 0.022 mm against 0.011 mm). Two weak points led to two changes. (i) The board was tilted only to 40 degrees, so the planar correction between 40 degrees and the 55 degree cut-off rested on inference from the sphere and on a simulated slope error that the map can represent exactly; a 50 degree board tilt is added to the plan (217 poses instead of 200, about 2 minutes more robot time). (ii) The smoothing search chose the largest value its grid offered for the position and slope terms; the grid’s ceiling is raised from 10^4 to 10^6. The simulation tests whether the plan can identify a known field; whether the real sensor’s errors fit the map’s form is shown only by the real captures’ held-out residuals. The rerun of the simulation with both changes is reported in the same folder.</w:t>
       </w:r>
     </w:p>
     <w:p>

</xml_diff>